<commit_message>
Make api.docx contain exclusively the AI instructions prompt text
</commit_message>
<xml_diff>
--- a/api_new.docx
+++ b/api_new.docx
@@ -3,187 +3,12 @@
 <w:document xmlns:wpc="http://schemas.microsoft.com/office/word/2010/wordprocessingCanvas" xmlns:mo="http://schemas.microsoft.com/office/mac/office/2008/main" xmlns:mc="http://schemas.openxmlformats.org/markup-compatibility/2006" xmlns:mv="urn:schemas-microsoft-com:mac:vml" xmlns:o="urn:schemas-microsoft-com:office:office" xmlns:r="http://schemas.openxmlformats.org/officeDocument/2006/relationships" xmlns:m="http://schemas.openxmlformats.org/officeDocument/2006/math" xmlns:v="urn:schemas-microsoft-com:vml" xmlns:wp14="http://schemas.microsoft.com/office/word/2010/wordprocessingDrawing" xmlns:wp="http://schemas.openxmlformats.org/drawingml/2006/wordprocessingDrawing" xmlns:w10="urn:schemas-microsoft-com:office:word" xmlns:w="http://schemas.openxmlformats.org/wordprocessingml/2006/main" xmlns:w14="http://schemas.microsoft.com/office/word/2010/wordml" xmlns:wpg="http://schemas.microsoft.com/office/word/2010/wordprocessingGroup" xmlns:wpi="http://schemas.microsoft.com/office/word/2010/wordprocessingInk" xmlns:wne="http://schemas.microsoft.com/office/word/2006/wordml" xmlns:wps="http://schemas.microsoft.com/office/word/2010/wordprocessingShape" mc:Ignorable="w14 wp14">
   <w:body>
     <w:p>
-      <w:pPr>
-        <w:jc w:val="center"/>
-      </w:pPr>
       <w:r>
-        <w:rPr>
-          <w:b/>
-          <w:sz w:val="36"/>
-        </w:rPr>
-        <w:t>GUÍA DE AUTOMATIZACIÓN EDITORIAL CON IA</w:t>
-      </w:r>
-    </w:p>
-    <w:p>
-      <w:pPr>
-        <w:jc w:val="center"/>
-      </w:pPr>
-      <w:r>
-        <w:rPr>
-          <w:i/>
-          <w:sz w:val="24"/>
-        </w:rPr>
-        <w:t>Instrucciones paso a paso para clonar este proceso en futuros proyectos web</w:t>
-      </w:r>
-    </w:p>
-    <w:p>
-      <w:r>
-        <w:br/>
-      </w:r>
-    </w:p>
-    <w:p>
-      <w:pPr>
-        <w:pStyle w:val="Heading1"/>
-      </w:pPr>
-      <w:r>
-        <w:t>1. Descripción del Sistema</w:t>
-      </w:r>
-    </w:p>
-    <w:p>
-      <w:r>
-        <w:t>Este documento detalla el procedimiento automatizado para la creación en lote (batch) de artículos de blog optimizados para SEO y maquetados con Tailwind CSS, sin intervención manual. Este sistema conecta directamente la base de datos PostgreSQL del proyecto con la API de DeepSeek utilizando un script de automatización en Node.js.</w:t>
-      </w:r>
-    </w:p>
-    <w:p>
-      <w:pPr>
-        <w:pStyle w:val="Heading1"/>
-      </w:pPr>
-      <w:r>
-        <w:t>2. Requisitos Previos</w:t>
-      </w:r>
-    </w:p>
-    <w:p>
-      <w:r>
-        <w:t>Para replicar este proceso en un nuevo sitio web, se necesita:</w:t>
-      </w:r>
-    </w:p>
-    <w:p>
-      <w:r>
-        <w:t>• Una cuenta activa en DeepSeek (con saldo en la plataforma de desarrollo).</w:t>
-      </w:r>
-    </w:p>
-    <w:p>
-      <w:r>
-        <w:t>• Una clave de API de DeepSeek directamente (puedes utilizar la clave actual: sk-177cec30fdd74db1ac9b23e204deade4).</w:t>
-      </w:r>
-    </w:p>
-    <w:p>
-      <w:r>
-        <w:t>• Una base de datos PostgreSQL conectada y con la tabla 'articles' creada y pre-poblada con los datos SEO básicos (título, keyword, slug, categoría, fecha, etc.) pero con el cuerpo de los artículos vacío ('').</w:t>
-      </w:r>
-    </w:p>
-    <w:p>
-      <w:pPr>
-        <w:pStyle w:val="Heading1"/>
-      </w:pPr>
-      <w:r>
-        <w:t>3. Configuración Paso a Paso</w:t>
-      </w:r>
-    </w:p>
-    <w:p>
-      <w:pPr>
-        <w:pStyle w:val="Heading2"/>
-      </w:pPr>
-      <w:r>
-        <w:t>Paso 3.1: Configurar el archivo de variables de entorno</w:t>
-      </w:r>
-    </w:p>
-    <w:p>
-      <w:r>
-        <w:t>En la raíz del nuevo proyecto, crea o modifica el archivo '.env.local' para incluir la clave de la API de DeepSeek:</w:t>
-      </w:r>
-    </w:p>
-    <w:p>
-      <w:pPr>
-        <w:ind w:left="720"/>
-      </w:pPr>
-      <w:r>
-        <w:rPr>
-          <w:rFonts w:ascii="Courier New" w:hAnsi="Courier New"/>
-          <w:sz w:val="20"/>
-        </w:rPr>
-        <w:t>DEEPSEEK_API_KEY=sk-177cec30fdd74db1ac9b23e204deade4</w:t>
-        <w:br/>
-        <w:t>DATABASE_URL=tu_conexion_postgresql_aqui</w:t>
-      </w:r>
-    </w:p>
-    <w:p>
-      <w:pPr>
-        <w:pStyle w:val="Heading2"/>
-      </w:pPr>
-      <w:r>
-        <w:t>Paso 3.2: Configurar la plantilla de redacción (template_general.md)</w:t>
-      </w:r>
-    </w:p>
-    <w:p>
-      <w:r>
-        <w:t>Como plantilla de redacción se debe utilizar el archivo 'template_general.md' que se encuentra en la carpeta del proyecto. Este archivo contiene las instrucciones editoriales detalladas para la IA. Por ejemplo, restricciones de longitud (2.500-3.500+ palabras), la prohibición estricta de emojis, la densidad de keywords y la directiva de usar maquetación HTML y Tailwind CSS (como tablas y tarjetas de llamada).</w:t>
-      </w:r>
-    </w:p>
-    <w:p>
-      <w:pPr>
-        <w:pStyle w:val="Heading2"/>
-      </w:pPr>
-      <w:r>
-        <w:t>Paso 3.3: Crear el script de generación (generateArticles.mjs)</w:t>
-      </w:r>
-    </w:p>
-    <w:p>
-      <w:r>
-        <w:t>Crea un script en la carpeta 'scripts/generateArticles.mjs' que lea los artículos vacíos de la base de datos, construya el prompt enviándolo a la API de DeepSeek ('https://api.deepseek.com/chat/completions' utilizando el modelo 'deepseek-chat') y guarde el HTML resultante de vuelta en la base de datos.</w:t>
-      </w:r>
-    </w:p>
-    <w:p>
-      <w:pPr>
-        <w:pStyle w:val="Heading2"/>
-      </w:pPr>
-      <w:r>
-        <w:t>Paso 3.4: Ejecución</w:t>
-      </w:r>
-    </w:p>
-    <w:p>
-      <w:r>
-        <w:t>Ejecuta el script con el siguiente comando en tu terminal:</w:t>
-      </w:r>
-    </w:p>
-    <w:p>
-      <w:pPr>
-        <w:ind w:left="720"/>
-      </w:pPr>
-      <w:r>
-        <w:rPr>
-          <w:rFonts w:ascii="Courier New" w:hAnsi="Courier New"/>
-          <w:b/>
-          <w:sz w:val="20"/>
-        </w:rPr>
-        <w:t>node scripts/generateArticles.mjs</w:t>
-      </w:r>
-    </w:p>
-    <w:p>
-      <w:pPr>
-        <w:pStyle w:val="Heading1"/>
-      </w:pPr>
-      <w:r>
-        <w:t>4. Prompt para el Agente de IA</w:t>
-      </w:r>
-    </w:p>
-    <w:p>
-      <w:r>
-        <w:t>Cuando inicies un nuevo proyecto web y quieras que yo (u otra IA) ejecute todo el proceso de forma autónoma, cópiale el siguiente texto literal:</w:t>
-      </w:r>
-    </w:p>
-    <w:p>
-      <w:pPr>
-        <w:ind w:left="720"/>
-      </w:pPr>
-      <w:r>
-        <w:rPr>
-          <w:rFonts w:ascii="Courier New" w:hAnsi="Courier New"/>
-          <w:sz w:val="19"/>
-        </w:rPr>
         <w:t>=== INSTRUCCIONES DE AUTOMATIZACIÓN EDITORIAL ===</w:t>
         <w:br/>
+        <w:br/>
         <w:t>Hola. Necesito que automatices la generación de contenido para mi nueva web. Por favor, haz lo siguiente:</w:t>
+        <w:br/>
         <w:br/>
         <w:t>1. Crea un script en la carpeta 'scripts/generateArticles.mjs' que:</w:t>
         <w:br/>
@@ -191,25 +16,19 @@
         <w:br/>
         <w:t xml:space="preserve">   - Lea el archivo de plantilla llamado 'template_general.md' en la raíz.</w:t>
         <w:br/>
-        <w:t xml:space="preserve">   - Obtenga todos los artículos de la base de datos PostgreSQL que tengan el campo 'content' vacío ('').</w:t>
+        <w:t xml:space="preserve">   - Obtenga todos los artículos de la base de datos PostgreSQL que tengan el campo 'content' vacío ('') o con longitud cero.</w:t>
         <w:br/>
         <w:t xml:space="preserve">   - Llame de forma secuencial a la API de DeepSeek (model: 'deepseek-chat', endpoint: 'https://api.deepseek.com/chat/completions') pasándole la plantilla y los metadatos de cada artículo (título, keyword, categoría).</w:t>
         <w:br/>
-        <w:t xml:space="preserve">   - Guarde el resultado HTML devuelto en la columna 'content' de la tabla 'articles'.</w:t>
+        <w:t xml:space="preserve">   - Habilite el formato JSON en la API y parsee las propiedades del JSON devuelto: 'title', 'meta_title', 'meta_description', 'excerpt' y 'content'.</w:t>
+        <w:br/>
+        <w:t xml:space="preserve">   - Realice un UPDATE en la base de datos PostgreSQL para rellenar estos campos del artículo correspondiente.</w:t>
+        <w:br/>
         <w:br/>
         <w:t>2. Usa el archivo 'template_general.md' en la raíz con directivas SEO estrictas: de 2500 a 3500+ palabras, estructurado en HTML con Tailwind CSS (tablas de comparativa, callouts), tono experto (EEAT) y sin emojis bajo ninguna circunstancia.</w:t>
         <w:br/>
-        <w:t>3. Ejecuta el script localmente para procesar los artículos y actualizar la base de datos de producción/desarrollo.</w:t>
-      </w:r>
-    </w:p>
-    <w:p>
-      <w:r>
         <w:br/>
-      </w:r>
-    </w:p>
-    <w:p>
-      <w:r>
-        <w:t>Guardado y listo para futuras réplicas editoriales.</w:t>
+        <w:t>3. Ejecuta el script localmente para procesar los artículos y actualizar la base de datos de producción/desarrollo de forma automática.</w:t>
       </w:r>
     </w:p>
     <w:sectPr>
@@ -586,8 +405,8 @@
     <w:qFormat/>
     <w:rsid w:val="00FC693F"/>
     <w:rPr>
-      <w:rFonts w:ascii="Arial" w:hAnsi="Arial"/>
-      <w:sz w:val="22"/>
+      <w:rFonts w:ascii="Courier New" w:hAnsi="Courier New"/>
+      <w:sz w:val="21"/>
     </w:rPr>
   </w:style>
   <w:style w:type="paragraph" w:styleId="Header">

</xml_diff>